<commit_message>
Actualización del documento con revisión final
</commit_message>
<xml_diff>
--- a/Administración de proyectos - segundo parcial.docx
+++ b/Administración de proyectos - segundo parcial.docx
@@ -645,13 +645,37 @@
           <w:b/>
           <w:bCs/>
         </w:rPr>
-        <w:t>Análisis de interesados (Stakeholders)</w:t>
+        <w:t>Análisis de interesados (</w:t>
+      </w:r>
+      <w:proofErr w:type="spellStart"/>
+      <w:r>
+        <w:rPr>
+          <w:b/>
+          <w:bCs/>
+        </w:rPr>
+        <w:t>Stakeholders</w:t>
+      </w:r>
+      <w:proofErr w:type="spellEnd"/>
+      <w:r>
+        <w:rPr>
+          <w:b/>
+          <w:bCs/>
+        </w:rPr>
+        <w:t>)</w:t>
       </w:r>
     </w:p>
     <w:p>
       <w:r>
         <w:lastRenderedPageBreak/>
-        <w:t>Los stakeholders son todas aquellas personas, grupos u organizaciones que pueden verse afectados por el desarrollo del proyecto o influir en su ejecución. Identificarlos permite comprender sus necesidades, expectativas y el nivel de participación que tendrán durante el proyecto, facilitando la toma de decisiones y la comunicación entre las partes involucradas.</w:t>
+        <w:t xml:space="preserve">Los </w:t>
+      </w:r>
+      <w:proofErr w:type="spellStart"/>
+      <w:r>
+        <w:t>stakeholders</w:t>
+      </w:r>
+      <w:proofErr w:type="spellEnd"/>
+      <w:r>
+        <w:t xml:space="preserve"> son todas aquellas personas, grupos u organizaciones que pueden verse afectados por el desarrollo del proyecto o influir en su ejecución. Identificarlos permite comprender sus necesidades, expectativas y el nivel de participación que tendrán durante el proyecto, facilitando la toma de decisiones y la comunicación entre las partes involucradas.</w:t>
       </w:r>
     </w:p>
     <w:p>
@@ -666,7 +690,15 @@
         <w:t>ESCALONES</w:t>
       </w:r>
       <w:r>
-        <w:t xml:space="preserve"> se identificaron los siguientes stakeholders principales:</w:t>
+        <w:t xml:space="preserve"> se identificaron los siguientes </w:t>
+      </w:r>
+      <w:proofErr w:type="spellStart"/>
+      <w:r>
+        <w:t>stakeholders</w:t>
+      </w:r>
+      <w:proofErr w:type="spellEnd"/>
+      <w:r>
+        <w:t xml:space="preserve"> principales:</w:t>
       </w:r>
     </w:p>
     <w:p/>
@@ -714,6 +746,7 @@
                 <w:bCs/>
               </w:rPr>
             </w:pPr>
+            <w:proofErr w:type="spellStart"/>
             <w:r>
               <w:rPr>
                 <w:b/>
@@ -721,6 +754,7 @@
               </w:rPr>
               <w:t>Stakeholder</w:t>
             </w:r>
+            <w:proofErr w:type="spellEnd"/>
           </w:p>
         </w:tc>
         <w:tc>
@@ -1131,8 +1165,17 @@
           <w:b/>
           <w:bCs/>
         </w:rPr>
-        <w:t>Análisis de los stakeholders</w:t>
-      </w:r>
+        <w:t xml:space="preserve">Análisis de los </w:t>
+      </w:r>
+      <w:proofErr w:type="spellStart"/>
+      <w:r>
+        <w:rPr>
+          <w:b/>
+          <w:bCs/>
+        </w:rPr>
+        <w:t>stakeholders</w:t>
+      </w:r>
+      <w:proofErr w:type="spellEnd"/>
     </w:p>
     <w:p>
       <w:r>
@@ -1186,7 +1229,15 @@
     </w:p>
     <w:p>
       <w:r>
-        <w:t>Debido a que cada stakeholder posee distintos intereses y niveles de influencia sobre el proyecto, será fundamental mantener una comunicación adecuada con cada uno de ellos durante todo el ciclo de desarrollo, favoreciendo la toma de decisiones y el cumplimiento de los objetivos establecidos.</w:t>
+        <w:t xml:space="preserve">Debido a que cada </w:t>
+      </w:r>
+      <w:proofErr w:type="spellStart"/>
+      <w:r>
+        <w:t>stakeholder</w:t>
+      </w:r>
+      <w:proofErr w:type="spellEnd"/>
+      <w:r>
+        <w:t xml:space="preserve"> posee distintos intereses y niveles de influencia sobre el proyecto, será fundamental mantener una comunicación adecuada con cada uno de ellos durante todo el ciclo de desarrollo, favoreciendo la toma de decisiones y el cumplimiento de los objetivos establecidos.</w:t>
       </w:r>
     </w:p>
     <w:p>
@@ -1277,7 +1328,15 @@
     </w:p>
     <w:p>
       <w:r>
-        <w:t>Se eligió Scrum porque permite desarrollar el proyecto de forma incremental e iterativa, entregando funcionalidades en períodos cortos de tiempo (sprints). Esto facilita validar los avances, detectar problemas de manera temprana y realizar ajustes según las necesidades del proyecto, sin afectar el desarrollo completo del sistema.</w:t>
+        <w:t>Se eligió Scrum porque permite desarrollar el proyecto de forma incremental e iterativa, entregando funcionalidades en períodos cortos de tiempo (</w:t>
+      </w:r>
+      <w:proofErr w:type="spellStart"/>
+      <w:r>
+        <w:t>sprints</w:t>
+      </w:r>
+      <w:proofErr w:type="spellEnd"/>
+      <w:r>
+        <w:t>). Esto facilita validar los avances, detectar problemas de manera temprana y realizar ajustes según las necesidades del proyecto, sin afectar el desarrollo completo del sistema.</w:t>
       </w:r>
     </w:p>
     <w:p>
@@ -1309,7 +1368,15 @@
         </w:numPr>
       </w:pPr>
       <w:r>
-        <w:t xml:space="preserve">Desarrollo del proyecto mediante Sprints, permitiendo dividir el trabajo en etapas pequeñas y controlables. </w:t>
+        <w:t xml:space="preserve">Desarrollo del proyecto mediante </w:t>
+      </w:r>
+      <w:proofErr w:type="spellStart"/>
+      <w:r>
+        <w:t>Sprints</w:t>
+      </w:r>
+      <w:proofErr w:type="spellEnd"/>
+      <w:r>
+        <w:t xml:space="preserve">, permitiendo dividir el trabajo en etapas pequeñas y controlables. </w:t>
       </w:r>
     </w:p>
     <w:p>
@@ -1321,7 +1388,15 @@
         </w:numPr>
       </w:pPr>
       <w:r>
-        <w:t xml:space="preserve">Organización de las tareas mediante un Product Backlog, donde se registrarán todos los requerimientos del sistema. </w:t>
+        <w:t xml:space="preserve">Organización de las tareas mediante un </w:t>
+      </w:r>
+      <w:proofErr w:type="spellStart"/>
+      <w:r>
+        <w:t>Product</w:t>
+      </w:r>
+      <w:proofErr w:type="spellEnd"/>
+      <w:r>
+        <w:t xml:space="preserve"> Backlog, donde se registrarán todos los requerimientos del sistema. </w:t>
       </w:r>
     </w:p>
     <w:p>
@@ -1793,6 +1868,7 @@
           <w:bCs/>
         </w:rPr>
       </w:pPr>
+      <w:proofErr w:type="spellStart"/>
       <w:r>
         <w:rPr>
           <w:b/>
@@ -1800,6 +1876,7 @@
         </w:rPr>
         <w:t>Milestones</w:t>
       </w:r>
+      <w:proofErr w:type="spellEnd"/>
     </w:p>
     <w:tbl>
       <w:tblPr>
@@ -2093,12 +2170,25 @@
     </w:p>
     <w:p>
       <w:r>
-        <w:t>Organización de los milestones</w:t>
-      </w:r>
-    </w:p>
-    <w:p>
-      <w:r>
-        <w:t xml:space="preserve">Los milestones fueron definidos teniendo en cuenta el orden lógico de desarrollo del sistema. En una primera etapa se implementarán las funcionalidades relacionadas con la gestión de usuarios, ya que constituyen la base para el acceso a la plataforma. Posteriormente se desarrollarán los módulos de impresiones y </w:t>
+        <w:t xml:space="preserve">Organización de los </w:t>
+      </w:r>
+      <w:proofErr w:type="spellStart"/>
+      <w:r>
+        <w:t>milestones</w:t>
+      </w:r>
+      <w:proofErr w:type="spellEnd"/>
+    </w:p>
+    <w:p>
+      <w:r>
+        <w:t xml:space="preserve">Los </w:t>
+      </w:r>
+      <w:proofErr w:type="spellStart"/>
+      <w:r>
+        <w:t>milestones</w:t>
+      </w:r>
+      <w:proofErr w:type="spellEnd"/>
+      <w:r>
+        <w:t xml:space="preserve"> fueron definidos teniendo en cuenta el orden lógico de desarrollo del sistema. En una primera etapa se implementarán las funcionalidades relacionadas con la gestión de usuarios, ya que constituyen la base para el acceso a la plataforma. Posteriormente se desarrollarán los módulos de impresiones y </w:t>
       </w:r>
       <w:r>
         <w:lastRenderedPageBreak/>
@@ -2126,17 +2216,34 @@
         </w:rPr>
         <w:t xml:space="preserve"> </w:t>
       </w:r>
-      <w:r>
-        <w:rPr>
-          <w:b/>
-          <w:bCs/>
-        </w:rPr>
-        <w:t>Product Backlog</w:t>
-      </w:r>
-    </w:p>
-    <w:p>
-      <w:r>
-        <w:t>El Product Backlog representa el conjunto de funcionalidades que deberá desarrollar el proyecto. Cada historia de usuario fue priorizada según el valor que aporta al sistema y su importancia para el desarrollo de las siguientes funcionalidades.</w:t>
+      <w:proofErr w:type="spellStart"/>
+      <w:r>
+        <w:rPr>
+          <w:b/>
+          <w:bCs/>
+        </w:rPr>
+        <w:t>Product</w:t>
+      </w:r>
+      <w:proofErr w:type="spellEnd"/>
+      <w:r>
+        <w:rPr>
+          <w:b/>
+          <w:bCs/>
+        </w:rPr>
+        <w:t xml:space="preserve"> Backlog</w:t>
+      </w:r>
+    </w:p>
+    <w:p>
+      <w:r>
+        <w:t xml:space="preserve">El </w:t>
+      </w:r>
+      <w:proofErr w:type="spellStart"/>
+      <w:r>
+        <w:t>Product</w:t>
+      </w:r>
+      <w:proofErr w:type="spellEnd"/>
+      <w:r>
+        <w:t xml:space="preserve"> Backlog representa el conjunto de funcionalidades que deberá desarrollar el proyecto. Cada historia de usuario fue priorizada según el valor que aporta al sistema y su importancia para el desarrollo de las siguientes funcionalidades.</w:t>
       </w:r>
     </w:p>
     <w:tbl>
@@ -3478,7 +3585,15 @@
     </w:p>
     <w:p>
       <w:r>
-        <w:t>El tablero se encuentra organizado mediante columnas que representan las distintas etapas del flujo de trabajo (Backlog, Sprint Backlog, Doing, Testing y Done), permitiendo realizar un seguimiento continuo del avance del proyecto.</w:t>
+        <w:t xml:space="preserve">El tablero se encuentra organizado mediante columnas que representan las distintas etapas del flujo de trabajo (Backlog, Sprint Backlog, Doing, </w:t>
+      </w:r>
+      <w:proofErr w:type="spellStart"/>
+      <w:r>
+        <w:t>Testing</w:t>
+      </w:r>
+      <w:proofErr w:type="spellEnd"/>
+      <w:r>
+        <w:t xml:space="preserve"> y Done), permitiendo realizar un seguimiento continuo del avance del proyecto.</w:t>
       </w:r>
     </w:p>
     <w:p>
@@ -5291,7 +5406,15 @@
     </w:p>
     <w:p>
       <w:r>
-        <w:t>Durante el desarrollo del proyecto surgió la necesidad de incorporar un sistema de notificaciones automáticas para mejorar la comunicación con los usuarios. Debido a este cambio, el equipo decidió reorganizar el Product Backlog y postergar el desarrollo de la aplicación móvil para una versión posterior. Esta decisión permitió mantener el alcance del proyecto sin afectar los tiempos establecidos.</w:t>
+        <w:t xml:space="preserve">Durante el desarrollo del proyecto surgió la necesidad de incorporar un sistema de notificaciones automáticas para mejorar la comunicación con los usuarios. Debido a este cambio, el equipo decidió reorganizar el </w:t>
+      </w:r>
+      <w:proofErr w:type="spellStart"/>
+      <w:r>
+        <w:t>Product</w:t>
+      </w:r>
+      <w:proofErr w:type="spellEnd"/>
+      <w:r>
+        <w:t xml:space="preserve"> Backlog y postergar el desarrollo de la aplicación móvil para una versión posterior. Esta decisión permitió mantener el alcance del proyecto sin afectar los tiempos establecidos.</w:t>
       </w:r>
     </w:p>
     <w:p>
@@ -5505,8 +5628,13 @@
                 </w:tcPr>
                 <w:p>
                   <w:r>
-                    <w:t>Incorporación de stakeholders</w:t>
+                    <w:t xml:space="preserve">Incorporación de </w:t>
                   </w:r>
+                  <w:proofErr w:type="spellStart"/>
+                  <w:r>
+                    <w:t>stakeholders</w:t>
+                  </w:r>
+                  <w:proofErr w:type="spellEnd"/>
                 </w:p>
               </w:tc>
             </w:tr>
@@ -5662,9 +5790,11 @@
             <w:vAlign w:val="center"/>
           </w:tcPr>
           <w:p>
+            <w:proofErr w:type="spellStart"/>
             <w:r>
               <w:t>Milestones</w:t>
             </w:r>
+            <w:proofErr w:type="spellEnd"/>
           </w:p>
         </w:tc>
       </w:tr>
@@ -5757,6 +5887,11 @@
     <w:p>
       <w:r>
         <w:t>El desarrollo del proyecto ESCALONES permitió aplicar herramientas y metodologías propias de la administración de proyectos, planificando el trabajo mediante objetivos SMART, historias de usuario, Scrum y tableros de seguimiento. La utilización de estas prácticas favorece una mejor organización del equipo, una adecuada planificación del desarrollo y una gestión eficiente de los cambios durante todo el ciclo de vida del proyecto.</w:t>
+      </w:r>
+    </w:p>
+    <w:p>
+      <w:r>
+        <w:t>Versión revisada para la entrega final.</w:t>
       </w:r>
     </w:p>
     <w:sectPr>

</xml_diff>